<commit_message>
Synchronize Word front matter with PDFs
</commit_message>
<xml_diff>
--- a/manuscript/final/Foziljon_Alisherov_Remittances_Shocks.docx
+++ b/manuscript/final/Foziljon_Alisherov_Remittances_Shocks.docx
@@ -26,7 +26,7 @@
           <w:rFonts w:ascii="Aptos" w:hAnsi="Aptos"/>
           <w:sz w:val="21"/>
         </w:rPr>
-        <w:t>Foziljon Alisherov¹ (ORCID: 0009-0004-9451-0518) and Mukhayyo Djuraeva¹ (ORCID: 0000-0001-6163-7513)</w:t>
+        <w:t>Foziljon Alisherov [1] (ORCID: 0009-0004-9451-0518) and Mukhayyo Djuraeva [1] (ORCID: 0000-0001-6163-7513)</w:t>
       </w:r>
     </w:p>
     <w:p>
@@ -38,7 +38,7 @@
           <w:rFonts w:ascii="Aptos" w:hAnsi="Aptos"/>
           <w:sz w:val="21"/>
         </w:rPr>
-        <w:t>¹ New Uzbekistan University</w:t>
+        <w:t>[1] New Uzbekistan University</w:t>
       </w:r>
     </w:p>
     <w:p>

</xml_diff>